<commit_message>
TruAgent multi-agent orchestrator MVP-- Documentation commit
</commit_message>
<xml_diff>
--- a/documentation/Documentation.docx
+++ b/documentation/Documentation.docx
@@ -199,7 +199,16 @@
       </w:r>
       <w:proofErr w:type="spellEnd"/>
       <w:r>
-        <w:t>, rule-based intent classification, JSON-based context handling, async agent execution.</w:t>
+        <w:t>,</w:t>
+      </w:r>
+      <w:r>
+        <w:t xml:space="preserve"> </w:t>
+      </w:r>
+      <w:r>
+        <w:t>LLM-based intent classification (Gemini) with a rule-based fallback</w:t>
+      </w:r>
+      <w:r>
+        <w:t>, JSON-based context handling, async agent execution.</w:t>
       </w:r>
     </w:p>
     <w:p>

</xml_diff>